<commit_message>
More changes - Still not functional.  DO NOT USE!!
* Migrate to the Cacti Scheduler
* Remove archive columns
* Reorder columns
* Re-create cache tables on upgrade
* Remove upgrade support for versions older than 0.7.4
*
</commit_message>
<xml_diff>
--- a/ReportIt Documentation.docx
+++ b/ReportIt Documentation.docx
@@ -1,6 +1,6 @@
 
 <file path=word/document.xml><?xml version="1.0" encoding="utf-8"?>
-<w:document xmlns:wpc="http://schemas.microsoft.com/office/word/2010/wordprocessingCanvas" xmlns:cx="http://schemas.microsoft.com/office/drawing/2014/chartex" xmlns:cx1="http://schemas.microsoft.com/office/drawing/2015/9/8/chartex" xmlns:cx2="http://schemas.microsoft.com/office/drawing/2015/10/21/chartex" xmlns:cx3="http://schemas.microsoft.com/office/drawing/2016/5/9/chartex" xmlns:cx4="http://schemas.microsoft.com/office/drawing/2016/5/10/chartex" xmlns:cx5="http://schemas.microsoft.com/office/drawing/2016/5/11/chartex" xmlns:cx6="http://schemas.microsoft.com/office/drawing/2016/5/12/chartex" xmlns:cx7="http://schemas.microsoft.com/office/drawing/2016/5/13/chartex" xmlns:cx8="http://schemas.microsoft.com/office/drawing/2016/5/14/chartex" xmlns:mc="http://schemas.openxmlformats.org/markup-compatibility/2006" xmlns:aink="http://schemas.microsoft.com/office/drawing/2016/ink" xmlns:am3d="http://schemas.microsoft.com/office/drawing/2017/model3d" xmlns:o="urn:schemas-microsoft-com:office:office" xmlns:oel="http://schemas.microsoft.com/office/2019/extlst" xmlns:r="http://schemas.openxmlformats.org/officeDocument/2006/relationships" xmlns:m="http://schemas.openxmlformats.org/officeDocument/2006/math" xmlns:v="urn:schemas-microsoft-com:vml" xmlns:wp14="http://schemas.microsoft.com/office/word/2010/wordprocessingDrawing" xmlns:wp="http://schemas.openxmlformats.org/drawingml/2006/wordprocessingDrawing" xmlns:w10="urn:schemas-microsoft-com:office:word" xmlns:w="http://schemas.openxmlformats.org/wordprocessingml/2006/main" xmlns:w14="http://schemas.microsoft.com/office/word/2010/wordml" xmlns:w15="http://schemas.microsoft.com/office/word/2012/wordml" xmlns:w16cex="http://schemas.microsoft.com/office/word/2018/wordml/cex" xmlns:w16cid="http://schemas.microsoft.com/office/word/2016/wordml/cid" xmlns:w16="http://schemas.microsoft.com/office/word/2018/wordml" xmlns:w16du="http://schemas.microsoft.com/office/word/2023/wordml/word16du" xmlns:w16sdtdh="http://schemas.microsoft.com/office/word/2020/wordml/sdtdatahash" xmlns:w16se="http://schemas.microsoft.com/office/word/2015/wordml/symex" xmlns:wpg="http://schemas.microsoft.com/office/word/2010/wordprocessingGroup" xmlns:wpi="http://schemas.microsoft.com/office/word/2010/wordprocessingInk" xmlns:wne="http://schemas.microsoft.com/office/word/2006/wordml" xmlns:wps="http://schemas.microsoft.com/office/word/2010/wordprocessingShape" mc:Ignorable="w14 w15 w16se w16cid w16 w16cex w16sdtdh w16du wp14">
+<w:document xmlns:wpc="http://schemas.microsoft.com/office/word/2010/wordprocessingCanvas" xmlns:cx="http://schemas.microsoft.com/office/drawing/2014/chartex" xmlns:cx1="http://schemas.microsoft.com/office/drawing/2015/9/8/chartex" xmlns:cx2="http://schemas.microsoft.com/office/drawing/2015/10/21/chartex" xmlns:cx3="http://schemas.microsoft.com/office/drawing/2016/5/9/chartex" xmlns:cx4="http://schemas.microsoft.com/office/drawing/2016/5/10/chartex" xmlns:cx5="http://schemas.microsoft.com/office/drawing/2016/5/11/chartex" xmlns:cx6="http://schemas.microsoft.com/office/drawing/2016/5/12/chartex" xmlns:cx7="http://schemas.microsoft.com/office/drawing/2016/5/13/chartex" xmlns:cx8="http://schemas.microsoft.com/office/drawing/2016/5/14/chartex" xmlns:mc="http://schemas.openxmlformats.org/markup-compatibility/2006" xmlns:aink="http://schemas.microsoft.com/office/drawing/2016/ink" xmlns:am3d="http://schemas.microsoft.com/office/drawing/2017/model3d" xmlns:o="urn:schemas-microsoft-com:office:office" xmlns:oel="http://schemas.microsoft.com/office/2019/extlst" xmlns:r="http://schemas.openxmlformats.org/officeDocument/2006/relationships" xmlns:m="http://schemas.openxmlformats.org/officeDocument/2006/math" xmlns:v="urn:schemas-microsoft-com:vml" xmlns:wp14="http://schemas.microsoft.com/office/word/2010/wordprocessingDrawing" xmlns:wp="http://schemas.openxmlformats.org/drawingml/2006/wordprocessingDrawing" xmlns:w10="urn:schemas-microsoft-com:office:word" xmlns:w="http://schemas.openxmlformats.org/wordprocessingml/2006/main" xmlns:w14="http://schemas.microsoft.com/office/word/2010/wordml" xmlns:w15="http://schemas.microsoft.com/office/word/2012/wordml" xmlns:w16cex="http://schemas.microsoft.com/office/word/2018/wordml/cex" xmlns:w16cid="http://schemas.microsoft.com/office/word/2016/wordml/cid" xmlns:w16="http://schemas.microsoft.com/office/word/2018/wordml" xmlns:w16du="http://schemas.microsoft.com/office/word/2023/wordml/word16du" xmlns:w16sdtdh="http://schemas.microsoft.com/office/word/2020/wordml/sdtdatahash" xmlns:w16sdtfl="http://schemas.microsoft.com/office/word/2024/wordml/sdtformatlock" xmlns:w16se="http://schemas.microsoft.com/office/word/2015/wordml/symex" xmlns:wpg="http://schemas.microsoft.com/office/word/2010/wordprocessingGroup" xmlns:wpi="http://schemas.microsoft.com/office/word/2010/wordprocessingInk" xmlns:wne="http://schemas.microsoft.com/office/word/2006/wordml" xmlns:wps="http://schemas.microsoft.com/office/word/2010/wordprocessingShape" mc:Ignorable="w14 w15 w16se w16cid w16 w16cex w16sdtdh w16sdtfl w16du wp14">
   <w:body>
     <w:p>
       <w:pPr>
@@ -31,7 +31,13 @@
         <w:rPr>
           <w:rFonts w:ascii="Arial" w:hAnsi="Arial" w:cs="Arial"/>
         </w:rPr>
-        <w:t>2.0</w:t>
+        <w:t>3</w:t>
+      </w:r>
+      <w:r>
+        <w:rPr>
+          <w:rFonts w:ascii="Arial" w:hAnsi="Arial" w:cs="Arial"/>
+        </w:rPr>
+        <w:t>.0</w:t>
       </w:r>
     </w:p>
     <w:p>
@@ -54,6 +60,14 @@
           <w:rFonts w:ascii="Arial" w:hAnsi="Arial" w:cs="Arial"/>
         </w:rPr>
         <w:t>The Cacti Reporting Plugin</w:t>
+      </w:r>
+    </w:p>
+    <w:p>
+      <w:pPr>
+        <w:pStyle w:val="Subtitle"/>
+      </w:pPr>
+      <w:r>
+        <w:t>Designed for Cacti 1.3+</w:t>
       </w:r>
     </w:p>
     <w:p>
@@ -88,19 +102,7 @@
         <w:rPr>
           <w:rFonts w:ascii="Arial" w:hAnsi="Arial" w:cs="Arial"/>
         </w:rPr>
-        <w:t>Copyright (c) 2009</w:t>
-      </w:r>
-      <w:r>
-        <w:rPr>
-          <w:rFonts w:ascii="Arial" w:hAnsi="Arial" w:cs="Arial"/>
-        </w:rPr>
-        <w:t xml:space="preserve">-2024 The Cacti Group and </w:t>
-      </w:r>
-      <w:r>
-        <w:rPr>
-          <w:rFonts w:ascii="Arial" w:hAnsi="Arial" w:cs="Arial"/>
-        </w:rPr>
-        <w:t>Andreas Braun</w:t>
+        <w:t>Copyright (c) 2009-2024 The Cacti Group and Andreas Braun</w:t>
       </w:r>
     </w:p>
     <w:p>
@@ -984,7 +986,19 @@
         <w:rPr>
           <w:rFonts w:ascii="Arial" w:hAnsi="Arial" w:cs="Arial"/>
         </w:rPr>
-        <w:t xml:space="preserve">Includes the ability to archive </w:t>
+        <w:t xml:space="preserve">Includes the ability to </w:t>
+      </w:r>
+      <w:r>
+        <w:rPr>
+          <w:rFonts w:ascii="Arial" w:hAnsi="Arial" w:cs="Arial"/>
+        </w:rPr>
+        <w:t>A</w:t>
+      </w:r>
+      <w:r>
+        <w:rPr>
+          <w:rFonts w:ascii="Arial" w:hAnsi="Arial" w:cs="Arial"/>
+        </w:rPr>
+        <w:t xml:space="preserve">rchive </w:t>
       </w:r>
       <w:r>
         <w:rPr>
@@ -1368,7 +1382,7 @@
           <w:noProof/>
         </w:rPr>
         <w:drawing>
-          <wp:inline distT="0" distB="0" distL="0" distR="0" wp14:anchorId="06DF9463" wp14:editId="11971D95">
+          <wp:inline distT="0" distB="0" distL="0" distR="0" wp14:anchorId="06DF9463" wp14:editId="379F676C">
             <wp:extent cx="5943600" cy="4533900"/>
             <wp:effectExtent l="0" t="0" r="0" b="0"/>
             <wp:docPr id="1146702927" name="Picture 1"/>
@@ -2139,6 +2153,7 @@
       <w:r>
         <w:rPr>
           <w:rFonts w:ascii="Arial" w:hAnsi="Arial" w:cs="Arial"/>
+          <w:noProof/>
         </w:rPr>
         <w:drawing>
           <wp:inline distT="0" distB="0" distL="0" distR="0" wp14:anchorId="17728AD8" wp14:editId="204535BF">
@@ -2253,6 +2268,7 @@
       <w:r>
         <w:rPr>
           <w:rFonts w:ascii="Arial" w:hAnsi="Arial" w:cs="Arial"/>
+          <w:noProof/>
         </w:rPr>
         <w:drawing>
           <wp:inline distT="0" distB="0" distL="0" distR="0" wp14:anchorId="3991C995" wp14:editId="205B01C4">
@@ -4319,21 +4335,7 @@
         <w:rPr>
           <w:rFonts w:ascii="Arial" w:hAnsi="Arial" w:cs="Arial"/>
         </w:rPr>
-        <w:t xml:space="preserve">Cacti provides a basic </w:t>
-      </w:r>
-      <w:proofErr w:type="spellStart"/>
-      <w:r>
-        <w:rPr>
-          <w:rFonts w:ascii="Arial" w:hAnsi="Arial" w:cs="Arial"/>
-        </w:rPr>
-        <w:t>poller</w:t>
-      </w:r>
-      <w:proofErr w:type="spellEnd"/>
-      <w:r>
-        <w:rPr>
-          <w:rFonts w:ascii="Arial" w:hAnsi="Arial" w:cs="Arial"/>
-        </w:rPr>
-        <w:t xml:space="preserve"> based scheduler that will run your scheduled reports each day at midnight.  If they are Daily Reports, they will be run each day at midnight</w:t>
+        <w:t>Cacti provides a basic poller based scheduler that will run your scheduled reports each day at midnight.  If they are Daily Reports, they will be run each day at midnight</w:t>
       </w:r>
       <w:r>
         <w:rPr>
@@ -4442,7 +4444,7 @@
 </file>
 
 <file path=word/endnotes.xml><?xml version="1.0" encoding="utf-8"?>
-<w:endnotes xmlns:wpc="http://schemas.microsoft.com/office/word/2010/wordprocessingCanvas" xmlns:cx="http://schemas.microsoft.com/office/drawing/2014/chartex" xmlns:cx1="http://schemas.microsoft.com/office/drawing/2015/9/8/chartex" xmlns:cx2="http://schemas.microsoft.com/office/drawing/2015/10/21/chartex" xmlns:cx3="http://schemas.microsoft.com/office/drawing/2016/5/9/chartex" xmlns:cx4="http://schemas.microsoft.com/office/drawing/2016/5/10/chartex" xmlns:cx5="http://schemas.microsoft.com/office/drawing/2016/5/11/chartex" xmlns:cx6="http://schemas.microsoft.com/office/drawing/2016/5/12/chartex" xmlns:cx7="http://schemas.microsoft.com/office/drawing/2016/5/13/chartex" xmlns:cx8="http://schemas.microsoft.com/office/drawing/2016/5/14/chartex" xmlns:mc="http://schemas.openxmlformats.org/markup-compatibility/2006" xmlns:aink="http://schemas.microsoft.com/office/drawing/2016/ink" xmlns:am3d="http://schemas.microsoft.com/office/drawing/2017/model3d" xmlns:o="urn:schemas-microsoft-com:office:office" xmlns:oel="http://schemas.microsoft.com/office/2019/extlst" xmlns:r="http://schemas.openxmlformats.org/officeDocument/2006/relationships" xmlns:m="http://schemas.openxmlformats.org/officeDocument/2006/math" xmlns:v="urn:schemas-microsoft-com:vml" xmlns:wp14="http://schemas.microsoft.com/office/word/2010/wordprocessingDrawing" xmlns:wp="http://schemas.openxmlformats.org/drawingml/2006/wordprocessingDrawing" xmlns:w10="urn:schemas-microsoft-com:office:word" xmlns:w="http://schemas.openxmlformats.org/wordprocessingml/2006/main" xmlns:w14="http://schemas.microsoft.com/office/word/2010/wordml" xmlns:w15="http://schemas.microsoft.com/office/word/2012/wordml" xmlns:w16cex="http://schemas.microsoft.com/office/word/2018/wordml/cex" xmlns:w16cid="http://schemas.microsoft.com/office/word/2016/wordml/cid" xmlns:w16="http://schemas.microsoft.com/office/word/2018/wordml" xmlns:w16du="http://schemas.microsoft.com/office/word/2023/wordml/word16du" xmlns:w16sdtdh="http://schemas.microsoft.com/office/word/2020/wordml/sdtdatahash" xmlns:w16se="http://schemas.microsoft.com/office/word/2015/wordml/symex" xmlns:wpg="http://schemas.microsoft.com/office/word/2010/wordprocessingGroup" xmlns:wpi="http://schemas.microsoft.com/office/word/2010/wordprocessingInk" xmlns:wne="http://schemas.microsoft.com/office/word/2006/wordml" xmlns:wps="http://schemas.microsoft.com/office/word/2010/wordprocessingShape" mc:Ignorable="w14 w15 w16se w16cid w16 w16cex w16sdtdh w16du wp14">
+<w:endnotes xmlns:wpc="http://schemas.microsoft.com/office/word/2010/wordprocessingCanvas" xmlns:cx="http://schemas.microsoft.com/office/drawing/2014/chartex" xmlns:cx1="http://schemas.microsoft.com/office/drawing/2015/9/8/chartex" xmlns:cx2="http://schemas.microsoft.com/office/drawing/2015/10/21/chartex" xmlns:cx3="http://schemas.microsoft.com/office/drawing/2016/5/9/chartex" xmlns:cx4="http://schemas.microsoft.com/office/drawing/2016/5/10/chartex" xmlns:cx5="http://schemas.microsoft.com/office/drawing/2016/5/11/chartex" xmlns:cx6="http://schemas.microsoft.com/office/drawing/2016/5/12/chartex" xmlns:cx7="http://schemas.microsoft.com/office/drawing/2016/5/13/chartex" xmlns:cx8="http://schemas.microsoft.com/office/drawing/2016/5/14/chartex" xmlns:mc="http://schemas.openxmlformats.org/markup-compatibility/2006" xmlns:aink="http://schemas.microsoft.com/office/drawing/2016/ink" xmlns:am3d="http://schemas.microsoft.com/office/drawing/2017/model3d" xmlns:o="urn:schemas-microsoft-com:office:office" xmlns:oel="http://schemas.microsoft.com/office/2019/extlst" xmlns:r="http://schemas.openxmlformats.org/officeDocument/2006/relationships" xmlns:m="http://schemas.openxmlformats.org/officeDocument/2006/math" xmlns:v="urn:schemas-microsoft-com:vml" xmlns:wp14="http://schemas.microsoft.com/office/word/2010/wordprocessingDrawing" xmlns:wp="http://schemas.openxmlformats.org/drawingml/2006/wordprocessingDrawing" xmlns:w10="urn:schemas-microsoft-com:office:word" xmlns:w="http://schemas.openxmlformats.org/wordprocessingml/2006/main" xmlns:w14="http://schemas.microsoft.com/office/word/2010/wordml" xmlns:w15="http://schemas.microsoft.com/office/word/2012/wordml" xmlns:w16cex="http://schemas.microsoft.com/office/word/2018/wordml/cex" xmlns:w16cid="http://schemas.microsoft.com/office/word/2016/wordml/cid" xmlns:w16="http://schemas.microsoft.com/office/word/2018/wordml" xmlns:w16du="http://schemas.microsoft.com/office/word/2023/wordml/word16du" xmlns:w16sdtdh="http://schemas.microsoft.com/office/word/2020/wordml/sdtdatahash" xmlns:w16sdtfl="http://schemas.microsoft.com/office/word/2024/wordml/sdtformatlock" xmlns:w16se="http://schemas.microsoft.com/office/word/2015/wordml/symex" xmlns:wpg="http://schemas.microsoft.com/office/word/2010/wordprocessingGroup" xmlns:wpi="http://schemas.microsoft.com/office/word/2010/wordprocessingInk" xmlns:wne="http://schemas.microsoft.com/office/word/2006/wordml" xmlns:wps="http://schemas.microsoft.com/office/word/2010/wordprocessingShape" mc:Ignorable="w14 w15 w16se w16cid w16 w16cex w16sdtdh w16sdtfl w16du wp14">
   <w:endnote w:type="separator" w:id="-1">
     <w:p>
       <w:pPr>
@@ -4467,7 +4469,7 @@
 </file>
 
 <file path=word/footer1.xml><?xml version="1.0" encoding="utf-8"?>
-<w:ftr xmlns:wpc="http://schemas.microsoft.com/office/word/2010/wordprocessingCanvas" xmlns:cx="http://schemas.microsoft.com/office/drawing/2014/chartex" xmlns:cx1="http://schemas.microsoft.com/office/drawing/2015/9/8/chartex" xmlns:cx2="http://schemas.microsoft.com/office/drawing/2015/10/21/chartex" xmlns:cx3="http://schemas.microsoft.com/office/drawing/2016/5/9/chartex" xmlns:cx4="http://schemas.microsoft.com/office/drawing/2016/5/10/chartex" xmlns:cx5="http://schemas.microsoft.com/office/drawing/2016/5/11/chartex" xmlns:cx6="http://schemas.microsoft.com/office/drawing/2016/5/12/chartex" xmlns:cx7="http://schemas.microsoft.com/office/drawing/2016/5/13/chartex" xmlns:cx8="http://schemas.microsoft.com/office/drawing/2016/5/14/chartex" xmlns:mc="http://schemas.openxmlformats.org/markup-compatibility/2006" xmlns:aink="http://schemas.microsoft.com/office/drawing/2016/ink" xmlns:am3d="http://schemas.microsoft.com/office/drawing/2017/model3d" xmlns:o="urn:schemas-microsoft-com:office:office" xmlns:oel="http://schemas.microsoft.com/office/2019/extlst" xmlns:r="http://schemas.openxmlformats.org/officeDocument/2006/relationships" xmlns:m="http://schemas.openxmlformats.org/officeDocument/2006/math" xmlns:v="urn:schemas-microsoft-com:vml" xmlns:wp14="http://schemas.microsoft.com/office/word/2010/wordprocessingDrawing" xmlns:wp="http://schemas.openxmlformats.org/drawingml/2006/wordprocessingDrawing" xmlns:w10="urn:schemas-microsoft-com:office:word" xmlns:w="http://schemas.openxmlformats.org/wordprocessingml/2006/main" xmlns:w14="http://schemas.microsoft.com/office/word/2010/wordml" xmlns:w15="http://schemas.microsoft.com/office/word/2012/wordml" xmlns:w16cex="http://schemas.microsoft.com/office/word/2018/wordml/cex" xmlns:w16cid="http://schemas.microsoft.com/office/word/2016/wordml/cid" xmlns:w16="http://schemas.microsoft.com/office/word/2018/wordml" xmlns:w16du="http://schemas.microsoft.com/office/word/2023/wordml/word16du" xmlns:w16sdtdh="http://schemas.microsoft.com/office/word/2020/wordml/sdtdatahash" xmlns:w16se="http://schemas.microsoft.com/office/word/2015/wordml/symex" xmlns:wpg="http://schemas.microsoft.com/office/word/2010/wordprocessingGroup" xmlns:wpi="http://schemas.microsoft.com/office/word/2010/wordprocessingInk" xmlns:wne="http://schemas.microsoft.com/office/word/2006/wordml" xmlns:wps="http://schemas.microsoft.com/office/word/2010/wordprocessingShape" mc:Ignorable="w14 w15 w16se w16cid w16 w16cex w16sdtdh w16du wp14">
+<w:ftr xmlns:wpc="http://schemas.microsoft.com/office/word/2010/wordprocessingCanvas" xmlns:cx="http://schemas.microsoft.com/office/drawing/2014/chartex" xmlns:cx1="http://schemas.microsoft.com/office/drawing/2015/9/8/chartex" xmlns:cx2="http://schemas.microsoft.com/office/drawing/2015/10/21/chartex" xmlns:cx3="http://schemas.microsoft.com/office/drawing/2016/5/9/chartex" xmlns:cx4="http://schemas.microsoft.com/office/drawing/2016/5/10/chartex" xmlns:cx5="http://schemas.microsoft.com/office/drawing/2016/5/11/chartex" xmlns:cx6="http://schemas.microsoft.com/office/drawing/2016/5/12/chartex" xmlns:cx7="http://schemas.microsoft.com/office/drawing/2016/5/13/chartex" xmlns:cx8="http://schemas.microsoft.com/office/drawing/2016/5/14/chartex" xmlns:mc="http://schemas.openxmlformats.org/markup-compatibility/2006" xmlns:aink="http://schemas.microsoft.com/office/drawing/2016/ink" xmlns:am3d="http://schemas.microsoft.com/office/drawing/2017/model3d" xmlns:o="urn:schemas-microsoft-com:office:office" xmlns:oel="http://schemas.microsoft.com/office/2019/extlst" xmlns:r="http://schemas.openxmlformats.org/officeDocument/2006/relationships" xmlns:m="http://schemas.openxmlformats.org/officeDocument/2006/math" xmlns:v="urn:schemas-microsoft-com:vml" xmlns:wp14="http://schemas.microsoft.com/office/word/2010/wordprocessingDrawing" xmlns:wp="http://schemas.openxmlformats.org/drawingml/2006/wordprocessingDrawing" xmlns:w10="urn:schemas-microsoft-com:office:word" xmlns:w="http://schemas.openxmlformats.org/wordprocessingml/2006/main" xmlns:w14="http://schemas.microsoft.com/office/word/2010/wordml" xmlns:w15="http://schemas.microsoft.com/office/word/2012/wordml" xmlns:w16cex="http://schemas.microsoft.com/office/word/2018/wordml/cex" xmlns:w16cid="http://schemas.microsoft.com/office/word/2016/wordml/cid" xmlns:w16="http://schemas.microsoft.com/office/word/2018/wordml" xmlns:w16du="http://schemas.microsoft.com/office/word/2023/wordml/word16du" xmlns:w16sdtdh="http://schemas.microsoft.com/office/word/2020/wordml/sdtdatahash" xmlns:w16sdtfl="http://schemas.microsoft.com/office/word/2024/wordml/sdtformatlock" xmlns:w16se="http://schemas.microsoft.com/office/word/2015/wordml/symex" xmlns:wpg="http://schemas.microsoft.com/office/word/2010/wordprocessingGroup" xmlns:wpi="http://schemas.microsoft.com/office/word/2010/wordprocessingInk" xmlns:wne="http://schemas.microsoft.com/office/word/2006/wordml" xmlns:wps="http://schemas.microsoft.com/office/word/2010/wordprocessingShape" mc:Ignorable="w14 w15 w16se w16cid w16 w16cex w16sdtdh w16sdtfl w16du wp14">
   <w:p>
     <w:pPr>
       <w:pStyle w:val="Footer"/>
@@ -4483,7 +4485,7 @@
 </file>
 
 <file path=word/footnotes.xml><?xml version="1.0" encoding="utf-8"?>
-<w:footnotes xmlns:wpc="http://schemas.microsoft.com/office/word/2010/wordprocessingCanvas" xmlns:cx="http://schemas.microsoft.com/office/drawing/2014/chartex" xmlns:cx1="http://schemas.microsoft.com/office/drawing/2015/9/8/chartex" xmlns:cx2="http://schemas.microsoft.com/office/drawing/2015/10/21/chartex" xmlns:cx3="http://schemas.microsoft.com/office/drawing/2016/5/9/chartex" xmlns:cx4="http://schemas.microsoft.com/office/drawing/2016/5/10/chartex" xmlns:cx5="http://schemas.microsoft.com/office/drawing/2016/5/11/chartex" xmlns:cx6="http://schemas.microsoft.com/office/drawing/2016/5/12/chartex" xmlns:cx7="http://schemas.microsoft.com/office/drawing/2016/5/13/chartex" xmlns:cx8="http://schemas.microsoft.com/office/drawing/2016/5/14/chartex" xmlns:mc="http://schemas.openxmlformats.org/markup-compatibility/2006" xmlns:aink="http://schemas.microsoft.com/office/drawing/2016/ink" xmlns:am3d="http://schemas.microsoft.com/office/drawing/2017/model3d" xmlns:o="urn:schemas-microsoft-com:office:office" xmlns:oel="http://schemas.microsoft.com/office/2019/extlst" xmlns:r="http://schemas.openxmlformats.org/officeDocument/2006/relationships" xmlns:m="http://schemas.openxmlformats.org/officeDocument/2006/math" xmlns:v="urn:schemas-microsoft-com:vml" xmlns:wp14="http://schemas.microsoft.com/office/word/2010/wordprocessingDrawing" xmlns:wp="http://schemas.openxmlformats.org/drawingml/2006/wordprocessingDrawing" xmlns:w10="urn:schemas-microsoft-com:office:word" xmlns:w="http://schemas.openxmlformats.org/wordprocessingml/2006/main" xmlns:w14="http://schemas.microsoft.com/office/word/2010/wordml" xmlns:w15="http://schemas.microsoft.com/office/word/2012/wordml" xmlns:w16cex="http://schemas.microsoft.com/office/word/2018/wordml/cex" xmlns:w16cid="http://schemas.microsoft.com/office/word/2016/wordml/cid" xmlns:w16="http://schemas.microsoft.com/office/word/2018/wordml" xmlns:w16du="http://schemas.microsoft.com/office/word/2023/wordml/word16du" xmlns:w16sdtdh="http://schemas.microsoft.com/office/word/2020/wordml/sdtdatahash" xmlns:w16se="http://schemas.microsoft.com/office/word/2015/wordml/symex" xmlns:wpg="http://schemas.microsoft.com/office/word/2010/wordprocessingGroup" xmlns:wpi="http://schemas.microsoft.com/office/word/2010/wordprocessingInk" xmlns:wne="http://schemas.microsoft.com/office/word/2006/wordml" xmlns:wps="http://schemas.microsoft.com/office/word/2010/wordprocessingShape" mc:Ignorable="w14 w15 w16se w16cid w16 w16cex w16sdtdh w16du wp14">
+<w:footnotes xmlns:wpc="http://schemas.microsoft.com/office/word/2010/wordprocessingCanvas" xmlns:cx="http://schemas.microsoft.com/office/drawing/2014/chartex" xmlns:cx1="http://schemas.microsoft.com/office/drawing/2015/9/8/chartex" xmlns:cx2="http://schemas.microsoft.com/office/drawing/2015/10/21/chartex" xmlns:cx3="http://schemas.microsoft.com/office/drawing/2016/5/9/chartex" xmlns:cx4="http://schemas.microsoft.com/office/drawing/2016/5/10/chartex" xmlns:cx5="http://schemas.microsoft.com/office/drawing/2016/5/11/chartex" xmlns:cx6="http://schemas.microsoft.com/office/drawing/2016/5/12/chartex" xmlns:cx7="http://schemas.microsoft.com/office/drawing/2016/5/13/chartex" xmlns:cx8="http://schemas.microsoft.com/office/drawing/2016/5/14/chartex" xmlns:mc="http://schemas.openxmlformats.org/markup-compatibility/2006" xmlns:aink="http://schemas.microsoft.com/office/drawing/2016/ink" xmlns:am3d="http://schemas.microsoft.com/office/drawing/2017/model3d" xmlns:o="urn:schemas-microsoft-com:office:office" xmlns:oel="http://schemas.microsoft.com/office/2019/extlst" xmlns:r="http://schemas.openxmlformats.org/officeDocument/2006/relationships" xmlns:m="http://schemas.openxmlformats.org/officeDocument/2006/math" xmlns:v="urn:schemas-microsoft-com:vml" xmlns:wp14="http://schemas.microsoft.com/office/word/2010/wordprocessingDrawing" xmlns:wp="http://schemas.openxmlformats.org/drawingml/2006/wordprocessingDrawing" xmlns:w10="urn:schemas-microsoft-com:office:word" xmlns:w="http://schemas.openxmlformats.org/wordprocessingml/2006/main" xmlns:w14="http://schemas.microsoft.com/office/word/2010/wordml" xmlns:w15="http://schemas.microsoft.com/office/word/2012/wordml" xmlns:w16cex="http://schemas.microsoft.com/office/word/2018/wordml/cex" xmlns:w16cid="http://schemas.microsoft.com/office/word/2016/wordml/cid" xmlns:w16="http://schemas.microsoft.com/office/word/2018/wordml" xmlns:w16du="http://schemas.microsoft.com/office/word/2023/wordml/word16du" xmlns:w16sdtdh="http://schemas.microsoft.com/office/word/2020/wordml/sdtdatahash" xmlns:w16sdtfl="http://schemas.microsoft.com/office/word/2024/wordml/sdtformatlock" xmlns:w16se="http://schemas.microsoft.com/office/word/2015/wordml/symex" xmlns:wpg="http://schemas.microsoft.com/office/word/2010/wordprocessingGroup" xmlns:wpi="http://schemas.microsoft.com/office/word/2010/wordprocessingInk" xmlns:wne="http://schemas.microsoft.com/office/word/2006/wordml" xmlns:wps="http://schemas.microsoft.com/office/word/2010/wordprocessingShape" mc:Ignorable="w14 w15 w16se w16cid w16 w16cex w16sdtdh w16sdtfl w16du wp14">
   <w:footnote w:type="separator" w:id="-1">
     <w:p>
       <w:pPr>
@@ -4508,7 +4510,7 @@
 </file>
 
 <file path=word/header1.xml><?xml version="1.0" encoding="utf-8"?>
-<w:hdr xmlns:wpc="http://schemas.microsoft.com/office/word/2010/wordprocessingCanvas" xmlns:cx="http://schemas.microsoft.com/office/drawing/2014/chartex" xmlns:cx1="http://schemas.microsoft.com/office/drawing/2015/9/8/chartex" xmlns:cx2="http://schemas.microsoft.com/office/drawing/2015/10/21/chartex" xmlns:cx3="http://schemas.microsoft.com/office/drawing/2016/5/9/chartex" xmlns:cx4="http://schemas.microsoft.com/office/drawing/2016/5/10/chartex" xmlns:cx5="http://schemas.microsoft.com/office/drawing/2016/5/11/chartex" xmlns:cx6="http://schemas.microsoft.com/office/drawing/2016/5/12/chartex" xmlns:cx7="http://schemas.microsoft.com/office/drawing/2016/5/13/chartex" xmlns:cx8="http://schemas.microsoft.com/office/drawing/2016/5/14/chartex" xmlns:mc="http://schemas.openxmlformats.org/markup-compatibility/2006" xmlns:aink="http://schemas.microsoft.com/office/drawing/2016/ink" xmlns:am3d="http://schemas.microsoft.com/office/drawing/2017/model3d" xmlns:o="urn:schemas-microsoft-com:office:office" xmlns:oel="http://schemas.microsoft.com/office/2019/extlst" xmlns:r="http://schemas.openxmlformats.org/officeDocument/2006/relationships" xmlns:m="http://schemas.openxmlformats.org/officeDocument/2006/math" xmlns:v="urn:schemas-microsoft-com:vml" xmlns:wp14="http://schemas.microsoft.com/office/word/2010/wordprocessingDrawing" xmlns:wp="http://schemas.openxmlformats.org/drawingml/2006/wordprocessingDrawing" xmlns:w10="urn:schemas-microsoft-com:office:word" xmlns:w="http://schemas.openxmlformats.org/wordprocessingml/2006/main" xmlns:w14="http://schemas.microsoft.com/office/word/2010/wordml" xmlns:w15="http://schemas.microsoft.com/office/word/2012/wordml" xmlns:w16cex="http://schemas.microsoft.com/office/word/2018/wordml/cex" xmlns:w16cid="http://schemas.microsoft.com/office/word/2016/wordml/cid" xmlns:w16="http://schemas.microsoft.com/office/word/2018/wordml" xmlns:w16du="http://schemas.microsoft.com/office/word/2023/wordml/word16du" xmlns:w16sdtdh="http://schemas.microsoft.com/office/word/2020/wordml/sdtdatahash" xmlns:w16se="http://schemas.microsoft.com/office/word/2015/wordml/symex" xmlns:wpg="http://schemas.microsoft.com/office/word/2010/wordprocessingGroup" xmlns:wpi="http://schemas.microsoft.com/office/word/2010/wordprocessingInk" xmlns:wne="http://schemas.microsoft.com/office/word/2006/wordml" xmlns:wps="http://schemas.microsoft.com/office/word/2010/wordprocessingShape" mc:Ignorable="w14 w15 w16se w16cid w16 w16cex w16sdtdh w16du wp14">
+<w:hdr xmlns:wpc="http://schemas.microsoft.com/office/word/2010/wordprocessingCanvas" xmlns:cx="http://schemas.microsoft.com/office/drawing/2014/chartex" xmlns:cx1="http://schemas.microsoft.com/office/drawing/2015/9/8/chartex" xmlns:cx2="http://schemas.microsoft.com/office/drawing/2015/10/21/chartex" xmlns:cx3="http://schemas.microsoft.com/office/drawing/2016/5/9/chartex" xmlns:cx4="http://schemas.microsoft.com/office/drawing/2016/5/10/chartex" xmlns:cx5="http://schemas.microsoft.com/office/drawing/2016/5/11/chartex" xmlns:cx6="http://schemas.microsoft.com/office/drawing/2016/5/12/chartex" xmlns:cx7="http://schemas.microsoft.com/office/drawing/2016/5/13/chartex" xmlns:cx8="http://schemas.microsoft.com/office/drawing/2016/5/14/chartex" xmlns:mc="http://schemas.openxmlformats.org/markup-compatibility/2006" xmlns:aink="http://schemas.microsoft.com/office/drawing/2016/ink" xmlns:am3d="http://schemas.microsoft.com/office/drawing/2017/model3d" xmlns:o="urn:schemas-microsoft-com:office:office" xmlns:oel="http://schemas.microsoft.com/office/2019/extlst" xmlns:r="http://schemas.openxmlformats.org/officeDocument/2006/relationships" xmlns:m="http://schemas.openxmlformats.org/officeDocument/2006/math" xmlns:v="urn:schemas-microsoft-com:vml" xmlns:wp14="http://schemas.microsoft.com/office/word/2010/wordprocessingDrawing" xmlns:wp="http://schemas.openxmlformats.org/drawingml/2006/wordprocessingDrawing" xmlns:w10="urn:schemas-microsoft-com:office:word" xmlns:w="http://schemas.openxmlformats.org/wordprocessingml/2006/main" xmlns:w14="http://schemas.microsoft.com/office/word/2010/wordml" xmlns:w15="http://schemas.microsoft.com/office/word/2012/wordml" xmlns:w16cex="http://schemas.microsoft.com/office/word/2018/wordml/cex" xmlns:w16cid="http://schemas.microsoft.com/office/word/2016/wordml/cid" xmlns:w16="http://schemas.microsoft.com/office/word/2018/wordml" xmlns:w16du="http://schemas.microsoft.com/office/word/2023/wordml/word16du" xmlns:w16sdtdh="http://schemas.microsoft.com/office/word/2020/wordml/sdtdatahash" xmlns:w16sdtfl="http://schemas.microsoft.com/office/word/2024/wordml/sdtformatlock" xmlns:w16se="http://schemas.microsoft.com/office/word/2015/wordml/symex" xmlns:wpg="http://schemas.microsoft.com/office/word/2010/wordprocessingGroup" xmlns:wpi="http://schemas.microsoft.com/office/word/2010/wordprocessingInk" xmlns:wne="http://schemas.microsoft.com/office/word/2006/wordml" xmlns:wps="http://schemas.microsoft.com/office/word/2010/wordprocessingShape" mc:Ignorable="w14 w15 w16se w16cid w16 w16cex w16sdtdh w16sdtfl w16du wp14">
   <w:p>
     <w:pPr>
       <w:pStyle w:val="Header"/>
@@ -4527,7 +4529,7 @@
 </file>
 
 <file path=word/numbering.xml><?xml version="1.0" encoding="utf-8"?>
-<w:numbering xmlns:wpc="http://schemas.microsoft.com/office/word/2010/wordprocessingCanvas" xmlns:cx="http://schemas.microsoft.com/office/drawing/2014/chartex" xmlns:cx1="http://schemas.microsoft.com/office/drawing/2015/9/8/chartex" xmlns:cx2="http://schemas.microsoft.com/office/drawing/2015/10/21/chartex" xmlns:cx3="http://schemas.microsoft.com/office/drawing/2016/5/9/chartex" xmlns:cx4="http://schemas.microsoft.com/office/drawing/2016/5/10/chartex" xmlns:cx5="http://schemas.microsoft.com/office/drawing/2016/5/11/chartex" xmlns:cx6="http://schemas.microsoft.com/office/drawing/2016/5/12/chartex" xmlns:cx7="http://schemas.microsoft.com/office/drawing/2016/5/13/chartex" xmlns:cx8="http://schemas.microsoft.com/office/drawing/2016/5/14/chartex" xmlns:mc="http://schemas.openxmlformats.org/markup-compatibility/2006" xmlns:aink="http://schemas.microsoft.com/office/drawing/2016/ink" xmlns:am3d="http://schemas.microsoft.com/office/drawing/2017/model3d" xmlns:o="urn:schemas-microsoft-com:office:office" xmlns:oel="http://schemas.microsoft.com/office/2019/extlst" xmlns:r="http://schemas.openxmlformats.org/officeDocument/2006/relationships" xmlns:m="http://schemas.openxmlformats.org/officeDocument/2006/math" xmlns:v="urn:schemas-microsoft-com:vml" xmlns:wp14="http://schemas.microsoft.com/office/word/2010/wordprocessingDrawing" xmlns:wp="http://schemas.openxmlformats.org/drawingml/2006/wordprocessingDrawing" xmlns:w10="urn:schemas-microsoft-com:office:word" xmlns:w="http://schemas.openxmlformats.org/wordprocessingml/2006/main" xmlns:w14="http://schemas.microsoft.com/office/word/2010/wordml" xmlns:w15="http://schemas.microsoft.com/office/word/2012/wordml" xmlns:w16cex="http://schemas.microsoft.com/office/word/2018/wordml/cex" xmlns:w16cid="http://schemas.microsoft.com/office/word/2016/wordml/cid" xmlns:w16="http://schemas.microsoft.com/office/word/2018/wordml" xmlns:w16du="http://schemas.microsoft.com/office/word/2023/wordml/word16du" xmlns:w16sdtdh="http://schemas.microsoft.com/office/word/2020/wordml/sdtdatahash" xmlns:w16se="http://schemas.microsoft.com/office/word/2015/wordml/symex" xmlns:wpg="http://schemas.microsoft.com/office/word/2010/wordprocessingGroup" xmlns:wpi="http://schemas.microsoft.com/office/word/2010/wordprocessingInk" xmlns:wne="http://schemas.microsoft.com/office/word/2006/wordml" xmlns:wps="http://schemas.microsoft.com/office/word/2010/wordprocessingShape" mc:Ignorable="w14 w15 w16se w16cid w16 w16cex w16sdtdh w16du wp14">
+<w:numbering xmlns:wpc="http://schemas.microsoft.com/office/word/2010/wordprocessingCanvas" xmlns:cx="http://schemas.microsoft.com/office/drawing/2014/chartex" xmlns:cx1="http://schemas.microsoft.com/office/drawing/2015/9/8/chartex" xmlns:cx2="http://schemas.microsoft.com/office/drawing/2015/10/21/chartex" xmlns:cx3="http://schemas.microsoft.com/office/drawing/2016/5/9/chartex" xmlns:cx4="http://schemas.microsoft.com/office/drawing/2016/5/10/chartex" xmlns:cx5="http://schemas.microsoft.com/office/drawing/2016/5/11/chartex" xmlns:cx6="http://schemas.microsoft.com/office/drawing/2016/5/12/chartex" xmlns:cx7="http://schemas.microsoft.com/office/drawing/2016/5/13/chartex" xmlns:cx8="http://schemas.microsoft.com/office/drawing/2016/5/14/chartex" xmlns:mc="http://schemas.openxmlformats.org/markup-compatibility/2006" xmlns:aink="http://schemas.microsoft.com/office/drawing/2016/ink" xmlns:am3d="http://schemas.microsoft.com/office/drawing/2017/model3d" xmlns:o="urn:schemas-microsoft-com:office:office" xmlns:oel="http://schemas.microsoft.com/office/2019/extlst" xmlns:r="http://schemas.openxmlformats.org/officeDocument/2006/relationships" xmlns:m="http://schemas.openxmlformats.org/officeDocument/2006/math" xmlns:v="urn:schemas-microsoft-com:vml" xmlns:wp14="http://schemas.microsoft.com/office/word/2010/wordprocessingDrawing" xmlns:wp="http://schemas.openxmlformats.org/drawingml/2006/wordprocessingDrawing" xmlns:w10="urn:schemas-microsoft-com:office:word" xmlns:w="http://schemas.openxmlformats.org/wordprocessingml/2006/main" xmlns:w14="http://schemas.microsoft.com/office/word/2010/wordml" xmlns:w15="http://schemas.microsoft.com/office/word/2012/wordml" xmlns:w16cex="http://schemas.microsoft.com/office/word/2018/wordml/cex" xmlns:w16cid="http://schemas.microsoft.com/office/word/2016/wordml/cid" xmlns:w16="http://schemas.microsoft.com/office/word/2018/wordml" xmlns:w16du="http://schemas.microsoft.com/office/word/2023/wordml/word16du" xmlns:w16sdtdh="http://schemas.microsoft.com/office/word/2020/wordml/sdtdatahash" xmlns:w16sdtfl="http://schemas.microsoft.com/office/word/2024/wordml/sdtformatlock" xmlns:w16se="http://schemas.microsoft.com/office/word/2015/wordml/symex" xmlns:wpg="http://schemas.microsoft.com/office/word/2010/wordprocessingGroup" xmlns:wpi="http://schemas.microsoft.com/office/word/2010/wordprocessingInk" xmlns:wne="http://schemas.microsoft.com/office/word/2006/wordml" xmlns:wps="http://schemas.microsoft.com/office/word/2010/wordprocessingShape" mc:Ignorable="w14 w15 w16se w16cid w16 w16cex w16sdtdh w16sdtfl w16du wp14">
   <w:abstractNum w:abstractNumId="0" w15:restartNumberingAfterBreak="0">
     <w:nsid w:val="12237796"/>
     <w:multiLevelType w:val="hybridMultilevel"/>
@@ -4980,7 +4982,7 @@
 </file>
 
 <file path=word/styles.xml><?xml version="1.0" encoding="utf-8"?>
-<w:styles xmlns:mc="http://schemas.openxmlformats.org/markup-compatibility/2006" xmlns:r="http://schemas.openxmlformats.org/officeDocument/2006/relationships" xmlns:w="http://schemas.openxmlformats.org/wordprocessingml/2006/main" xmlns:w14="http://schemas.microsoft.com/office/word/2010/wordml" xmlns:w15="http://schemas.microsoft.com/office/word/2012/wordml" xmlns:w16cex="http://schemas.microsoft.com/office/word/2018/wordml/cex" xmlns:w16cid="http://schemas.microsoft.com/office/word/2016/wordml/cid" xmlns:w16="http://schemas.microsoft.com/office/word/2018/wordml" xmlns:w16du="http://schemas.microsoft.com/office/word/2023/wordml/word16du" xmlns:w16sdtdh="http://schemas.microsoft.com/office/word/2020/wordml/sdtdatahash" xmlns:w16se="http://schemas.microsoft.com/office/word/2015/wordml/symex" mc:Ignorable="w14 w15 w16se w16cid w16 w16cex w16sdtdh w16du">
+<w:styles xmlns:mc="http://schemas.openxmlformats.org/markup-compatibility/2006" xmlns:r="http://schemas.openxmlformats.org/officeDocument/2006/relationships" xmlns:w="http://schemas.openxmlformats.org/wordprocessingml/2006/main" xmlns:w14="http://schemas.microsoft.com/office/word/2010/wordml" xmlns:w15="http://schemas.microsoft.com/office/word/2012/wordml" xmlns:w16cex="http://schemas.microsoft.com/office/word/2018/wordml/cex" xmlns:w16cid="http://schemas.microsoft.com/office/word/2016/wordml/cid" xmlns:w16="http://schemas.microsoft.com/office/word/2018/wordml" xmlns:w16du="http://schemas.microsoft.com/office/word/2023/wordml/word16du" xmlns:w16sdtdh="http://schemas.microsoft.com/office/word/2020/wordml/sdtdatahash" xmlns:w16sdtfl="http://schemas.microsoft.com/office/word/2024/wordml/sdtformatlock" xmlns:w16se="http://schemas.microsoft.com/office/word/2015/wordml/symex" mc:Ignorable="w14 w15 w16se w16cid w16 w16cex w16sdtdh w16sdtfl w16du">
   <w:docDefaults>
     <w:rPrDefault>
       <w:rPr>
@@ -5632,6 +5634,7 @@
   <w:style w:type="character" w:default="1" w:styleId="DefaultParagraphFont">
     <w:name w:val="Default Paragraph Font"/>
     <w:uiPriority w:val="1"/>
+    <w:semiHidden/>
     <w:unhideWhenUsed/>
   </w:style>
   <w:style w:type="table" w:default="1" w:styleId="TableNormal">

</xml_diff>